<commit_message>
Sửa layout: phiếu nghiệm thu gọn 1 trang, phần ký rộng hơn, section bàn giao
- Phiếu đề nghị nghiệm thu: bảng ký được sinh động theo các bên tham gia
  (BLOCK_KY_YC) thay cho khối ký cố định, bảng "nội dung/ý kiến" nén còn
  2 dòng mỗi mục -> mọi phiếu vừa đúng 1 trang.
- Phần ký của biên bản: bỏ dòng tên công ty dưới "ĐẠI DIỆN ...", thêm
  khoảng trống để ký cho thoáng.
- Biên bản bàn giao: ngắt section chuyển xuống sau phần nội dung nên mỗi
  biên bản là một section trọn vẹn — footer không còn lệch sang trang phân
  cách, bản bàn giao cuối lấy đúng khổ trang thay vì kế thừa khổ trang
  phân cách, và số trang đánh lại từ 1 cho từng biên bản.
- Trang phân cách PHẦN X giữ đúng khổ trang phân cách (có viền, không
  footer) và luôn bắt đầu ở trang mới.
- Không sinh thêm section rỗng (trang trắng) ở cuối tài liệu.

Kiểm thử: 18 tình huống (matrix + matrix2) đạt kiểm tra cấu trúc OOXML,
kiểm tra nội dung theo đợt, và dựng PDF đối chiếu số trang từng biểu mẫu.
</commit_message>
<xml_diff>
--- a/hoso_chatluong_template.docx
+++ b/hoso_chatluong_template.docx
@@ -1834,128 +1834,14 @@
         <w:spacing w:after="60" w:line="264" w:lineRule="auto"/>
       </w:pPr>
     </w:p>
-    <w:tbl>
-      <w:tblPr>
-        <w:tblW w:w="9638" w:type="dxa"/>
-        <w:tblBorders>
-          <w:top w:val="none" w:sz="0" w:space="0" w:color="FFFFFF"/>
-          <w:left w:val="none" w:sz="0" w:space="0" w:color="FFFFFF"/>
-          <w:bottom w:val="none" w:sz="0" w:space="0" w:color="FFFFFF"/>
-          <w:right w:val="none" w:sz="0" w:space="0" w:color="FFFFFF"/>
-          <w:insideH w:val="none" w:sz="0" w:space="0" w:color="FFFFFF"/>
-          <w:insideV w:val="none" w:sz="0" w:space="0" w:color="FFFFFF"/>
-        </w:tblBorders>
-        <w:tblCellMar>
-          <w:left w:w="10" w:type="dxa"/>
-          <w:right w:w="10" w:type="dxa"/>
-        </w:tblCellMar>
-        <w:tblLook w:val="0000" w:firstRow="0" w:lastRow="0" w:firstColumn="0" w:lastColumn="0" w:noHBand="0" w:noVBand="0"/>
-      </w:tblPr>
-      <w:tblGrid>
-        <w:gridCol w:w="4000"/>
-        <w:gridCol w:w="5638"/>
-      </w:tblGrid>
-      <w:tr>
-        <w:tc>
-          <w:tcPr>
-            <w:tcW w:w="4000" w:type="dxa"/>
-            <w:tcMar>
-              <w:top w:w="40" w:type="dxa"/>
-              <w:left w:w="70" w:type="dxa"/>
-              <w:bottom w:w="40" w:type="dxa"/>
-              <w:right w:w="70" w:type="dxa"/>
-            </w:tcMar>
-          </w:tcPr>
-          <w:p>
-            <w:pPr>
-              <w:spacing w:line="264" w:lineRule="auto"/>
-            </w:pPr>
-          </w:p>
-        </w:tc>
-        <w:tc>
-          <w:tcPr>
-            <w:tcW w:w="5638" w:type="dxa"/>
-            <w:tcMar>
-              <w:top w:w="40" w:type="dxa"/>
-              <w:left w:w="70" w:type="dxa"/>
-              <w:bottom w:w="40" w:type="dxa"/>
-              <w:right w:w="70" w:type="dxa"/>
-            </w:tcMar>
-          </w:tcPr>
-          <w:p>
-            <w:pPr>
-              <w:spacing w:line="264" w:lineRule="auto"/>
-              <w:jc w:val="center"/>
-            </w:pPr>
-            <w:r>
-              <w:rPr>
-                <w:b/>
-                <w:bCs/>
-                <w:sz w:val="22"/>
-                <w:szCs w:val="22"/>
-              </w:rPr>
-              <w:t>ĐƠN VỊ CUNG CẤP &amp; THI CÔNG THANG MÁY</w:t>
-            </w:r>
-          </w:p>
-          <w:p>
-            <w:pPr>
-              <w:spacing w:line="264" w:lineRule="auto"/>
-              <w:jc w:val="center"/>
-            </w:pPr>
-            <w:r>
-              <w:rPr>
-                <w:i/>
-                <w:iCs/>
-                <w:sz w:val="20"/>
-                <w:szCs w:val="20"/>
-                <w:u w:val="single"/>
-              </w:rPr>
-              <w:t>(Ký, ghi rõ họ tên)</w:t>
-            </w:r>
-          </w:p>
-          <w:p>
-            <w:pPr>
-              <w:spacing w:line="264" w:lineRule="auto"/>
-            </w:pPr>
-          </w:p>
-          <w:p>
-            <w:pPr>
-              <w:spacing w:line="264" w:lineRule="auto"/>
-            </w:pPr>
-          </w:p>
-          <w:p>
-            <w:pPr>
-              <w:spacing w:line="264" w:lineRule="auto"/>
-              <w:jc w:val="center"/>
-            </w:pPr>
-            <w:r>
-              <w:rPr>
-                <w:b/>
-                <w:bCs/>
-                <w:sz w:val="22"/>
-                <w:szCs w:val="22"/>
-              </w:rPr>
-              <w:t>Lại Xuân Hóa</w:t>
-            </w:r>
-          </w:p>
-          <w:p>
-            <w:pPr>
-              <w:spacing w:line="264" w:lineRule="auto"/>
-              <w:jc w:val="center"/>
-            </w:pPr>
-            <w:r>
-              <w:rPr>
-                <w:i/>
-                <w:iCs/>
-                <w:sz w:val="20"/>
-                <w:szCs w:val="20"/>
-              </w:rPr>
-              <w:t>Chỉ huy trưởng</w:t>
-            </w:r>
-          </w:p>
-        </w:tc>
-      </w:tr>
-    </w:tbl>
+    <w:p>
+      <w:pPr>
+        <w:spacing w:after="20" w:line="264" w:lineRule="auto"/>
+      </w:pPr>
+      <w:r>
+        <w:t>{{BLOCK_KY_YC}}</w:t>
+      </w:r>
+    </w:p>
     <w:p>
       <w:pPr>
         <w:sectPr>
@@ -8649,128 +8535,14 @@
         <w:spacing w:after="60" w:line="264" w:lineRule="auto"/>
       </w:pPr>
     </w:p>
-    <w:tbl>
-      <w:tblPr>
-        <w:tblW w:w="9638" w:type="dxa"/>
-        <w:tblBorders>
-          <w:top w:val="none" w:sz="0" w:space="0" w:color="FFFFFF"/>
-          <w:left w:val="none" w:sz="0" w:space="0" w:color="FFFFFF"/>
-          <w:bottom w:val="none" w:sz="0" w:space="0" w:color="FFFFFF"/>
-          <w:right w:val="none" w:sz="0" w:space="0" w:color="FFFFFF"/>
-          <w:insideH w:val="none" w:sz="0" w:space="0" w:color="FFFFFF"/>
-          <w:insideV w:val="none" w:sz="0" w:space="0" w:color="FFFFFF"/>
-        </w:tblBorders>
-        <w:tblCellMar>
-          <w:left w:w="10" w:type="dxa"/>
-          <w:right w:w="10" w:type="dxa"/>
-        </w:tblCellMar>
-        <w:tblLook w:val="0000" w:firstRow="0" w:lastRow="0" w:firstColumn="0" w:lastColumn="0" w:noHBand="0" w:noVBand="0"/>
-      </w:tblPr>
-      <w:tblGrid>
-        <w:gridCol w:w="4000"/>
-        <w:gridCol w:w="5638"/>
-      </w:tblGrid>
-      <w:tr>
-        <w:tc>
-          <w:tcPr>
-            <w:tcW w:w="4000" w:type="dxa"/>
-            <w:tcMar>
-              <w:top w:w="40" w:type="dxa"/>
-              <w:left w:w="70" w:type="dxa"/>
-              <w:bottom w:w="40" w:type="dxa"/>
-              <w:right w:w="70" w:type="dxa"/>
-            </w:tcMar>
-          </w:tcPr>
-          <w:p>
-            <w:pPr>
-              <w:spacing w:line="264" w:lineRule="auto"/>
-            </w:pPr>
-          </w:p>
-        </w:tc>
-        <w:tc>
-          <w:tcPr>
-            <w:tcW w:w="5638" w:type="dxa"/>
-            <w:tcMar>
-              <w:top w:w="40" w:type="dxa"/>
-              <w:left w:w="70" w:type="dxa"/>
-              <w:bottom w:w="40" w:type="dxa"/>
-              <w:right w:w="70" w:type="dxa"/>
-            </w:tcMar>
-          </w:tcPr>
-          <w:p>
-            <w:pPr>
-              <w:spacing w:line="264" w:lineRule="auto"/>
-              <w:jc w:val="center"/>
-            </w:pPr>
-            <w:r>
-              <w:rPr>
-                <w:b/>
-                <w:bCs/>
-                <w:sz w:val="22"/>
-                <w:szCs w:val="22"/>
-              </w:rPr>
-              <w:t>ĐƠN VỊ CUNG CẤP &amp; THI CÔNG THANG MÁY</w:t>
-            </w:r>
-          </w:p>
-          <w:p>
-            <w:pPr>
-              <w:spacing w:line="264" w:lineRule="auto"/>
-              <w:jc w:val="center"/>
-            </w:pPr>
-            <w:r>
-              <w:rPr>
-                <w:i/>
-                <w:iCs/>
-                <w:sz w:val="20"/>
-                <w:szCs w:val="20"/>
-                <w:u w:val="single"/>
-              </w:rPr>
-              <w:t>(Ký, ghi rõ họ tên)</w:t>
-            </w:r>
-          </w:p>
-          <w:p>
-            <w:pPr>
-              <w:spacing w:line="264" w:lineRule="auto"/>
-            </w:pPr>
-          </w:p>
-          <w:p>
-            <w:pPr>
-              <w:spacing w:line="264" w:lineRule="auto"/>
-            </w:pPr>
-          </w:p>
-          <w:p>
-            <w:pPr>
-              <w:spacing w:line="264" w:lineRule="auto"/>
-              <w:jc w:val="center"/>
-            </w:pPr>
-            <w:r>
-              <w:rPr>
-                <w:b/>
-                <w:bCs/>
-                <w:sz w:val="22"/>
-                <w:szCs w:val="22"/>
-              </w:rPr>
-              <w:t>Lại Xuân Hóa</w:t>
-            </w:r>
-          </w:p>
-          <w:p>
-            <w:pPr>
-              <w:spacing w:line="264" w:lineRule="auto"/>
-              <w:jc w:val="center"/>
-            </w:pPr>
-            <w:r>
-              <w:rPr>
-                <w:i/>
-                <w:iCs/>
-                <w:sz w:val="20"/>
-                <w:szCs w:val="20"/>
-              </w:rPr>
-              <w:t>Chỉ huy trưởng</w:t>
-            </w:r>
-          </w:p>
-        </w:tc>
-      </w:tr>
-    </w:tbl>
+    <w:p>
+      <w:pPr>
+        <w:spacing w:after="20" w:line="264" w:lineRule="auto"/>
+      </w:pPr>
+      <w:r>
+        <w:t>{{BLOCK_KY_YC}}</w:t>
+      </w:r>
+    </w:p>
     <w:p>
       <w:pPr>
         <w:sectPr>
@@ -15818,128 +15590,14 @@
         <w:spacing w:after="60" w:line="264" w:lineRule="auto"/>
       </w:pPr>
     </w:p>
-    <w:tbl>
-      <w:tblPr>
-        <w:tblW w:w="9638" w:type="dxa"/>
-        <w:tblBorders>
-          <w:top w:val="none" w:sz="0" w:space="0" w:color="FFFFFF"/>
-          <w:left w:val="none" w:sz="0" w:space="0" w:color="FFFFFF"/>
-          <w:bottom w:val="none" w:sz="0" w:space="0" w:color="FFFFFF"/>
-          <w:right w:val="none" w:sz="0" w:space="0" w:color="FFFFFF"/>
-          <w:insideH w:val="none" w:sz="0" w:space="0" w:color="FFFFFF"/>
-          <w:insideV w:val="none" w:sz="0" w:space="0" w:color="FFFFFF"/>
-        </w:tblBorders>
-        <w:tblCellMar>
-          <w:left w:w="10" w:type="dxa"/>
-          <w:right w:w="10" w:type="dxa"/>
-        </w:tblCellMar>
-        <w:tblLook w:val="0000" w:firstRow="0" w:lastRow="0" w:firstColumn="0" w:lastColumn="0" w:noHBand="0" w:noVBand="0"/>
-      </w:tblPr>
-      <w:tblGrid>
-        <w:gridCol w:w="4000"/>
-        <w:gridCol w:w="5638"/>
-      </w:tblGrid>
-      <w:tr>
-        <w:tc>
-          <w:tcPr>
-            <w:tcW w:w="4000" w:type="dxa"/>
-            <w:tcMar>
-              <w:top w:w="40" w:type="dxa"/>
-              <w:left w:w="70" w:type="dxa"/>
-              <w:bottom w:w="40" w:type="dxa"/>
-              <w:right w:w="70" w:type="dxa"/>
-            </w:tcMar>
-          </w:tcPr>
-          <w:p>
-            <w:pPr>
-              <w:spacing w:line="264" w:lineRule="auto"/>
-            </w:pPr>
-          </w:p>
-        </w:tc>
-        <w:tc>
-          <w:tcPr>
-            <w:tcW w:w="5638" w:type="dxa"/>
-            <w:tcMar>
-              <w:top w:w="40" w:type="dxa"/>
-              <w:left w:w="70" w:type="dxa"/>
-              <w:bottom w:w="40" w:type="dxa"/>
-              <w:right w:w="70" w:type="dxa"/>
-            </w:tcMar>
-          </w:tcPr>
-          <w:p>
-            <w:pPr>
-              <w:spacing w:line="264" w:lineRule="auto"/>
-              <w:jc w:val="center"/>
-            </w:pPr>
-            <w:r>
-              <w:rPr>
-                <w:b/>
-                <w:bCs/>
-                <w:sz w:val="22"/>
-                <w:szCs w:val="22"/>
-              </w:rPr>
-              <w:t>ĐƠN VỊ CUNG CẤP &amp; THI CÔNG THANG MÁY</w:t>
-            </w:r>
-          </w:p>
-          <w:p>
-            <w:pPr>
-              <w:spacing w:line="264" w:lineRule="auto"/>
-              <w:jc w:val="center"/>
-            </w:pPr>
-            <w:r>
-              <w:rPr>
-                <w:i/>
-                <w:iCs/>
-                <w:sz w:val="20"/>
-                <w:szCs w:val="20"/>
-                <w:u w:val="single"/>
-              </w:rPr>
-              <w:t>(Ký, ghi rõ họ tên)</w:t>
-            </w:r>
-          </w:p>
-          <w:p>
-            <w:pPr>
-              <w:spacing w:line="264" w:lineRule="auto"/>
-            </w:pPr>
-          </w:p>
-          <w:p>
-            <w:pPr>
-              <w:spacing w:line="264" w:lineRule="auto"/>
-            </w:pPr>
-          </w:p>
-          <w:p>
-            <w:pPr>
-              <w:spacing w:line="264" w:lineRule="auto"/>
-              <w:jc w:val="center"/>
-            </w:pPr>
-            <w:r>
-              <w:rPr>
-                <w:b/>
-                <w:bCs/>
-                <w:sz w:val="22"/>
-                <w:szCs w:val="22"/>
-              </w:rPr>
-              <w:t>Lại Xuân Hóa</w:t>
-            </w:r>
-          </w:p>
-          <w:p>
-            <w:pPr>
-              <w:spacing w:line="264" w:lineRule="auto"/>
-              <w:jc w:val="center"/>
-            </w:pPr>
-            <w:r>
-              <w:rPr>
-                <w:i/>
-                <w:iCs/>
-                <w:sz w:val="20"/>
-                <w:szCs w:val="20"/>
-              </w:rPr>
-              <w:t>Chỉ huy trưởng</w:t>
-            </w:r>
-          </w:p>
-        </w:tc>
-      </w:tr>
-    </w:tbl>
+    <w:p>
+      <w:pPr>
+        <w:spacing w:after="20" w:line="264" w:lineRule="auto"/>
+      </w:pPr>
+      <w:r>
+        <w:t>{{BLOCK_KY_YC}}</w:t>
+      </w:r>
+    </w:p>
     <w:p>
       <w:pPr>
         <w:sectPr>
@@ -22404,128 +22062,14 @@
         <w:spacing w:after="60" w:line="264" w:lineRule="auto"/>
       </w:pPr>
     </w:p>
-    <w:tbl>
-      <w:tblPr>
-        <w:tblW w:w="9638" w:type="dxa"/>
-        <w:tblBorders>
-          <w:top w:val="none" w:sz="0" w:space="0" w:color="FFFFFF"/>
-          <w:left w:val="none" w:sz="0" w:space="0" w:color="FFFFFF"/>
-          <w:bottom w:val="none" w:sz="0" w:space="0" w:color="FFFFFF"/>
-          <w:right w:val="none" w:sz="0" w:space="0" w:color="FFFFFF"/>
-          <w:insideH w:val="none" w:sz="0" w:space="0" w:color="FFFFFF"/>
-          <w:insideV w:val="none" w:sz="0" w:space="0" w:color="FFFFFF"/>
-        </w:tblBorders>
-        <w:tblCellMar>
-          <w:left w:w="10" w:type="dxa"/>
-          <w:right w:w="10" w:type="dxa"/>
-        </w:tblCellMar>
-        <w:tblLook w:val="0000" w:firstRow="0" w:lastRow="0" w:firstColumn="0" w:lastColumn="0" w:noHBand="0" w:noVBand="0"/>
-      </w:tblPr>
-      <w:tblGrid>
-        <w:gridCol w:w="4000"/>
-        <w:gridCol w:w="5638"/>
-      </w:tblGrid>
-      <w:tr>
-        <w:tc>
-          <w:tcPr>
-            <w:tcW w:w="4000" w:type="dxa"/>
-            <w:tcMar>
-              <w:top w:w="40" w:type="dxa"/>
-              <w:left w:w="70" w:type="dxa"/>
-              <w:bottom w:w="40" w:type="dxa"/>
-              <w:right w:w="70" w:type="dxa"/>
-            </w:tcMar>
-          </w:tcPr>
-          <w:p>
-            <w:pPr>
-              <w:spacing w:line="264" w:lineRule="auto"/>
-            </w:pPr>
-          </w:p>
-        </w:tc>
-        <w:tc>
-          <w:tcPr>
-            <w:tcW w:w="5638" w:type="dxa"/>
-            <w:tcMar>
-              <w:top w:w="40" w:type="dxa"/>
-              <w:left w:w="70" w:type="dxa"/>
-              <w:bottom w:w="40" w:type="dxa"/>
-              <w:right w:w="70" w:type="dxa"/>
-            </w:tcMar>
-          </w:tcPr>
-          <w:p>
-            <w:pPr>
-              <w:spacing w:line="264" w:lineRule="auto"/>
-              <w:jc w:val="center"/>
-            </w:pPr>
-            <w:r>
-              <w:rPr>
-                <w:b/>
-                <w:bCs/>
-                <w:sz w:val="22"/>
-                <w:szCs w:val="22"/>
-              </w:rPr>
-              <w:t>ĐƠN VỊ CUNG CẤP &amp; THI CÔNG THANG MÁY</w:t>
-            </w:r>
-          </w:p>
-          <w:p>
-            <w:pPr>
-              <w:spacing w:line="264" w:lineRule="auto"/>
-              <w:jc w:val="center"/>
-            </w:pPr>
-            <w:r>
-              <w:rPr>
-                <w:i/>
-                <w:iCs/>
-                <w:sz w:val="20"/>
-                <w:szCs w:val="20"/>
-                <w:u w:val="single"/>
-              </w:rPr>
-              <w:t>(Ký, ghi rõ họ tên)</w:t>
-            </w:r>
-          </w:p>
-          <w:p>
-            <w:pPr>
-              <w:spacing w:line="264" w:lineRule="auto"/>
-            </w:pPr>
-          </w:p>
-          <w:p>
-            <w:pPr>
-              <w:spacing w:line="264" w:lineRule="auto"/>
-            </w:pPr>
-          </w:p>
-          <w:p>
-            <w:pPr>
-              <w:spacing w:line="264" w:lineRule="auto"/>
-              <w:jc w:val="center"/>
-            </w:pPr>
-            <w:r>
-              <w:rPr>
-                <w:b/>
-                <w:bCs/>
-                <w:sz w:val="22"/>
-                <w:szCs w:val="22"/>
-              </w:rPr>
-              <w:t>Lại Xuân Hóa</w:t>
-            </w:r>
-          </w:p>
-          <w:p>
-            <w:pPr>
-              <w:spacing w:line="264" w:lineRule="auto"/>
-              <w:jc w:val="center"/>
-            </w:pPr>
-            <w:r>
-              <w:rPr>
-                <w:i/>
-                <w:iCs/>
-                <w:sz w:val="20"/>
-                <w:szCs w:val="20"/>
-              </w:rPr>
-              <w:t>Chỉ huy trưởng</w:t>
-            </w:r>
-          </w:p>
-        </w:tc>
-      </w:tr>
-    </w:tbl>
+    <w:p>
+      <w:pPr>
+        <w:spacing w:after="20" w:line="264" w:lineRule="auto"/>
+      </w:pPr>
+      <w:r>
+        <w:t>{{BLOCK_KY_YC}}</w:t>
+      </w:r>
+    </w:p>
     <w:p>
       <w:pPr>
         <w:sectPr>
@@ -28117,128 +27661,14 @@
         <w:spacing w:after="60" w:line="264" w:lineRule="auto"/>
       </w:pPr>
     </w:p>
-    <w:tbl>
-      <w:tblPr>
-        <w:tblW w:w="9638" w:type="dxa"/>
-        <w:tblBorders>
-          <w:top w:val="none" w:sz="0" w:space="0" w:color="FFFFFF"/>
-          <w:left w:val="none" w:sz="0" w:space="0" w:color="FFFFFF"/>
-          <w:bottom w:val="none" w:sz="0" w:space="0" w:color="FFFFFF"/>
-          <w:right w:val="none" w:sz="0" w:space="0" w:color="FFFFFF"/>
-          <w:insideH w:val="none" w:sz="0" w:space="0" w:color="FFFFFF"/>
-          <w:insideV w:val="none" w:sz="0" w:space="0" w:color="FFFFFF"/>
-        </w:tblBorders>
-        <w:tblCellMar>
-          <w:left w:w="10" w:type="dxa"/>
-          <w:right w:w="10" w:type="dxa"/>
-        </w:tblCellMar>
-        <w:tblLook w:val="0000" w:firstRow="0" w:lastRow="0" w:firstColumn="0" w:lastColumn="0" w:noHBand="0" w:noVBand="0"/>
-      </w:tblPr>
-      <w:tblGrid>
-        <w:gridCol w:w="4000"/>
-        <w:gridCol w:w="5638"/>
-      </w:tblGrid>
-      <w:tr>
-        <w:tc>
-          <w:tcPr>
-            <w:tcW w:w="4000" w:type="dxa"/>
-            <w:tcMar>
-              <w:top w:w="40" w:type="dxa"/>
-              <w:left w:w="70" w:type="dxa"/>
-              <w:bottom w:w="40" w:type="dxa"/>
-              <w:right w:w="70" w:type="dxa"/>
-            </w:tcMar>
-          </w:tcPr>
-          <w:p>
-            <w:pPr>
-              <w:spacing w:line="264" w:lineRule="auto"/>
-            </w:pPr>
-          </w:p>
-        </w:tc>
-        <w:tc>
-          <w:tcPr>
-            <w:tcW w:w="5638" w:type="dxa"/>
-            <w:tcMar>
-              <w:top w:w="40" w:type="dxa"/>
-              <w:left w:w="70" w:type="dxa"/>
-              <w:bottom w:w="40" w:type="dxa"/>
-              <w:right w:w="70" w:type="dxa"/>
-            </w:tcMar>
-          </w:tcPr>
-          <w:p>
-            <w:pPr>
-              <w:spacing w:line="264" w:lineRule="auto"/>
-              <w:jc w:val="center"/>
-            </w:pPr>
-            <w:r>
-              <w:rPr>
-                <w:b/>
-                <w:bCs/>
-                <w:sz w:val="22"/>
-                <w:szCs w:val="22"/>
-              </w:rPr>
-              <w:t>ĐƠN VỊ CUNG CẤP &amp; THI CÔNG THANG MÁY</w:t>
-            </w:r>
-          </w:p>
-          <w:p>
-            <w:pPr>
-              <w:spacing w:line="264" w:lineRule="auto"/>
-              <w:jc w:val="center"/>
-            </w:pPr>
-            <w:r>
-              <w:rPr>
-                <w:i/>
-                <w:iCs/>
-                <w:sz w:val="20"/>
-                <w:szCs w:val="20"/>
-                <w:u w:val="single"/>
-              </w:rPr>
-              <w:t>(Ký, ghi rõ họ tên)</w:t>
-            </w:r>
-          </w:p>
-          <w:p>
-            <w:pPr>
-              <w:spacing w:line="264" w:lineRule="auto"/>
-            </w:pPr>
-          </w:p>
-          <w:p>
-            <w:pPr>
-              <w:spacing w:line="264" w:lineRule="auto"/>
-            </w:pPr>
-          </w:p>
-          <w:p>
-            <w:pPr>
-              <w:spacing w:line="264" w:lineRule="auto"/>
-              <w:jc w:val="center"/>
-            </w:pPr>
-            <w:r>
-              <w:rPr>
-                <w:b/>
-                <w:bCs/>
-                <w:sz w:val="22"/>
-                <w:szCs w:val="22"/>
-              </w:rPr>
-              <w:t>Lại Xuân Hóa</w:t>
-            </w:r>
-          </w:p>
-          <w:p>
-            <w:pPr>
-              <w:spacing w:line="264" w:lineRule="auto"/>
-              <w:jc w:val="center"/>
-            </w:pPr>
-            <w:r>
-              <w:rPr>
-                <w:i/>
-                <w:iCs/>
-                <w:sz w:val="20"/>
-                <w:szCs w:val="20"/>
-              </w:rPr>
-              <w:t>Chỉ huy trưởng</w:t>
-            </w:r>
-          </w:p>
-        </w:tc>
-      </w:tr>
-    </w:tbl>
+    <w:p>
+      <w:pPr>
+        <w:spacing w:after="20" w:line="264" w:lineRule="auto"/>
+      </w:pPr>
+      <w:r>
+        <w:t>{{BLOCK_KY_YC}}</w:t>
+      </w:r>
+    </w:p>
     <w:p>
       <w:pPr>
         <w:sectPr>
@@ -34371,128 +33801,14 @@
         <w:spacing w:after="60" w:line="264" w:lineRule="auto"/>
       </w:pPr>
     </w:p>
-    <w:tbl>
-      <w:tblPr>
-        <w:tblW w:w="9638" w:type="dxa"/>
-        <w:tblBorders>
-          <w:top w:val="none" w:sz="0" w:space="0" w:color="FFFFFF"/>
-          <w:left w:val="none" w:sz="0" w:space="0" w:color="FFFFFF"/>
-          <w:bottom w:val="none" w:sz="0" w:space="0" w:color="FFFFFF"/>
-          <w:right w:val="none" w:sz="0" w:space="0" w:color="FFFFFF"/>
-          <w:insideH w:val="none" w:sz="0" w:space="0" w:color="FFFFFF"/>
-          <w:insideV w:val="none" w:sz="0" w:space="0" w:color="FFFFFF"/>
-        </w:tblBorders>
-        <w:tblCellMar>
-          <w:left w:w="10" w:type="dxa"/>
-          <w:right w:w="10" w:type="dxa"/>
-        </w:tblCellMar>
-        <w:tblLook w:val="0000" w:firstRow="0" w:lastRow="0" w:firstColumn="0" w:lastColumn="0" w:noHBand="0" w:noVBand="0"/>
-      </w:tblPr>
-      <w:tblGrid>
-        <w:gridCol w:w="4000"/>
-        <w:gridCol w:w="5638"/>
-      </w:tblGrid>
-      <w:tr>
-        <w:tc>
-          <w:tcPr>
-            <w:tcW w:w="4000" w:type="dxa"/>
-            <w:tcMar>
-              <w:top w:w="40" w:type="dxa"/>
-              <w:left w:w="70" w:type="dxa"/>
-              <w:bottom w:w="40" w:type="dxa"/>
-              <w:right w:w="70" w:type="dxa"/>
-            </w:tcMar>
-          </w:tcPr>
-          <w:p>
-            <w:pPr>
-              <w:spacing w:line="264" w:lineRule="auto"/>
-            </w:pPr>
-          </w:p>
-        </w:tc>
-        <w:tc>
-          <w:tcPr>
-            <w:tcW w:w="5638" w:type="dxa"/>
-            <w:tcMar>
-              <w:top w:w="40" w:type="dxa"/>
-              <w:left w:w="70" w:type="dxa"/>
-              <w:bottom w:w="40" w:type="dxa"/>
-              <w:right w:w="70" w:type="dxa"/>
-            </w:tcMar>
-          </w:tcPr>
-          <w:p>
-            <w:pPr>
-              <w:spacing w:line="264" w:lineRule="auto"/>
-              <w:jc w:val="center"/>
-            </w:pPr>
-            <w:r>
-              <w:rPr>
-                <w:b/>
-                <w:bCs/>
-                <w:sz w:val="22"/>
-                <w:szCs w:val="22"/>
-              </w:rPr>
-              <w:t>ĐƠN VỊ CUNG CẤP &amp; THI CÔNG THANG MÁY</w:t>
-            </w:r>
-          </w:p>
-          <w:p>
-            <w:pPr>
-              <w:spacing w:line="264" w:lineRule="auto"/>
-              <w:jc w:val="center"/>
-            </w:pPr>
-            <w:r>
-              <w:rPr>
-                <w:i/>
-                <w:iCs/>
-                <w:sz w:val="20"/>
-                <w:szCs w:val="20"/>
-                <w:u w:val="single"/>
-              </w:rPr>
-              <w:t>(Ký, ghi rõ họ tên)</w:t>
-            </w:r>
-          </w:p>
-          <w:p>
-            <w:pPr>
-              <w:spacing w:line="264" w:lineRule="auto"/>
-            </w:pPr>
-          </w:p>
-          <w:p>
-            <w:pPr>
-              <w:spacing w:line="264" w:lineRule="auto"/>
-            </w:pPr>
-          </w:p>
-          <w:p>
-            <w:pPr>
-              <w:spacing w:line="264" w:lineRule="auto"/>
-              <w:jc w:val="center"/>
-            </w:pPr>
-            <w:r>
-              <w:rPr>
-                <w:b/>
-                <w:bCs/>
-                <w:sz w:val="22"/>
-                <w:szCs w:val="22"/>
-              </w:rPr>
-              <w:t>Lại Xuân Hóa</w:t>
-            </w:r>
-          </w:p>
-          <w:p>
-            <w:pPr>
-              <w:spacing w:line="264" w:lineRule="auto"/>
-              <w:jc w:val="center"/>
-            </w:pPr>
-            <w:r>
-              <w:rPr>
-                <w:i/>
-                <w:iCs/>
-                <w:sz w:val="20"/>
-                <w:szCs w:val="20"/>
-              </w:rPr>
-              <w:t>Chỉ huy trưởng</w:t>
-            </w:r>
-          </w:p>
-        </w:tc>
-      </w:tr>
-    </w:tbl>
+    <w:p>
+      <w:pPr>
+        <w:spacing w:after="20" w:line="264" w:lineRule="auto"/>
+      </w:pPr>
+      <w:r>
+        <w:t>{{BLOCK_KY_YC}}</w:t>
+      </w:r>
+    </w:p>
     <w:p>
       <w:pPr>
         <w:sectPr>
@@ -40265,128 +39581,14 @@
         <w:spacing w:after="60" w:line="264" w:lineRule="auto"/>
       </w:pPr>
     </w:p>
-    <w:tbl>
-      <w:tblPr>
-        <w:tblW w:w="9638" w:type="dxa"/>
-        <w:tblBorders>
-          <w:top w:val="none" w:sz="0" w:space="0" w:color="FFFFFF"/>
-          <w:left w:val="none" w:sz="0" w:space="0" w:color="FFFFFF"/>
-          <w:bottom w:val="none" w:sz="0" w:space="0" w:color="FFFFFF"/>
-          <w:right w:val="none" w:sz="0" w:space="0" w:color="FFFFFF"/>
-          <w:insideH w:val="none" w:sz="0" w:space="0" w:color="FFFFFF"/>
-          <w:insideV w:val="none" w:sz="0" w:space="0" w:color="FFFFFF"/>
-        </w:tblBorders>
-        <w:tblCellMar>
-          <w:left w:w="10" w:type="dxa"/>
-          <w:right w:w="10" w:type="dxa"/>
-        </w:tblCellMar>
-        <w:tblLook w:val="0000" w:firstRow="0" w:lastRow="0" w:firstColumn="0" w:lastColumn="0" w:noHBand="0" w:noVBand="0"/>
-      </w:tblPr>
-      <w:tblGrid>
-        <w:gridCol w:w="4000"/>
-        <w:gridCol w:w="5638"/>
-      </w:tblGrid>
-      <w:tr>
-        <w:tc>
-          <w:tcPr>
-            <w:tcW w:w="4000" w:type="dxa"/>
-            <w:tcMar>
-              <w:top w:w="40" w:type="dxa"/>
-              <w:left w:w="70" w:type="dxa"/>
-              <w:bottom w:w="40" w:type="dxa"/>
-              <w:right w:w="70" w:type="dxa"/>
-            </w:tcMar>
-          </w:tcPr>
-          <w:p>
-            <w:pPr>
-              <w:spacing w:line="264" w:lineRule="auto"/>
-            </w:pPr>
-          </w:p>
-        </w:tc>
-        <w:tc>
-          <w:tcPr>
-            <w:tcW w:w="5638" w:type="dxa"/>
-            <w:tcMar>
-              <w:top w:w="40" w:type="dxa"/>
-              <w:left w:w="70" w:type="dxa"/>
-              <w:bottom w:w="40" w:type="dxa"/>
-              <w:right w:w="70" w:type="dxa"/>
-            </w:tcMar>
-          </w:tcPr>
-          <w:p>
-            <w:pPr>
-              <w:spacing w:line="264" w:lineRule="auto"/>
-              <w:jc w:val="center"/>
-            </w:pPr>
-            <w:r>
-              <w:rPr>
-                <w:b/>
-                <w:bCs/>
-                <w:sz w:val="22"/>
-                <w:szCs w:val="22"/>
-              </w:rPr>
-              <w:t>ĐƠN VỊ CUNG CẤP &amp; THI CÔNG THANG MÁY</w:t>
-            </w:r>
-          </w:p>
-          <w:p>
-            <w:pPr>
-              <w:spacing w:line="264" w:lineRule="auto"/>
-              <w:jc w:val="center"/>
-            </w:pPr>
-            <w:r>
-              <w:rPr>
-                <w:i/>
-                <w:iCs/>
-                <w:sz w:val="20"/>
-                <w:szCs w:val="20"/>
-                <w:u w:val="single"/>
-              </w:rPr>
-              <w:t>(Ký, ghi rõ họ tên)</w:t>
-            </w:r>
-          </w:p>
-          <w:p>
-            <w:pPr>
-              <w:spacing w:line="264" w:lineRule="auto"/>
-            </w:pPr>
-          </w:p>
-          <w:p>
-            <w:pPr>
-              <w:spacing w:line="264" w:lineRule="auto"/>
-            </w:pPr>
-          </w:p>
-          <w:p>
-            <w:pPr>
-              <w:spacing w:line="264" w:lineRule="auto"/>
-              <w:jc w:val="center"/>
-            </w:pPr>
-            <w:r>
-              <w:rPr>
-                <w:b/>
-                <w:bCs/>
-                <w:sz w:val="22"/>
-                <w:szCs w:val="22"/>
-              </w:rPr>
-              <w:t>Lại Xuân Hóa</w:t>
-            </w:r>
-          </w:p>
-          <w:p>
-            <w:pPr>
-              <w:spacing w:line="264" w:lineRule="auto"/>
-              <w:jc w:val="center"/>
-            </w:pPr>
-            <w:r>
-              <w:rPr>
-                <w:i/>
-                <w:iCs/>
-                <w:sz w:val="20"/>
-                <w:szCs w:val="20"/>
-              </w:rPr>
-              <w:t>Chỉ huy trưởng</w:t>
-            </w:r>
-          </w:p>
-        </w:tc>
-      </w:tr>
-    </w:tbl>
+    <w:p>
+      <w:pPr>
+        <w:spacing w:after="20" w:line="264" w:lineRule="auto"/>
+      </w:pPr>
+      <w:r>
+        <w:t>{{BLOCK_KY_YC}}</w:t>
+      </w:r>
+    </w:p>
     <w:p>
       <w:pPr>
         <w:sectPr>
@@ -45649,6 +44851,22 @@
       </w:r>
     </w:p>
     <w:p>
+      <w:pPr>
+        <w:sectPr>
+          <w:footerReference w:type="default" r:id="rId38"/>
+          <w:pgSz w:w="11907" w:h="16840"/>
+          <w:pgMar w:top="1134" w:right="851" w:bottom="990" w:left="1418" w:header="708" w:footer="708" w:gutter="0"/>
+          <w:pgBorders w:offsetFrom="page">
+            <w:top w:val="single" w:sz="18" w:space="24" w:color="000000"/>
+            <w:left w:val="single" w:sz="18" w:space="24" w:color="000000"/>
+            <w:bottom w:val="single" w:sz="18" w:space="24" w:color="000000"/>
+            <w:right w:val="single" w:sz="18" w:space="24" w:color="000000"/>
+          </w:pgBorders>
+          <w:pgNumType w:start="1"/>
+          <w:cols w:space="720"/>
+          <w:docGrid w:linePitch="360"/>
+        </w:sectPr>
+      </w:pPr>
       <w:r>
         <w:t>{{BBG_BEGIN}}</w:t>
       </w:r>
@@ -45773,11 +44991,18 @@
     <w:p>
       <w:pPr>
         <w:sectPr>
-          <w:footerReference w:type="default" r:id="rId41"/>
-          <w:pgSz w:w="11906" w:h="16838" w:code="9"/>
-          <w:pgMar w:top="1560" w:right="864" w:bottom="1500" w:left="1296" w:header="270" w:footer="340" w:gutter="0"/>
-          <w:cols w:space="540"/>
-          <w:docGrid w:linePitch="240"/>
+          <w:footerReference w:type="default" r:id="rId38"/>
+          <w:pgSz w:w="11907" w:h="16840"/>
+          <w:pgMar w:top="1134" w:right="851" w:bottom="990" w:left="1418" w:header="708" w:footer="708" w:gutter="0"/>
+          <w:pgBorders w:offsetFrom="page">
+            <w:top w:val="single" w:sz="18" w:space="24" w:color="000000"/>
+            <w:left w:val="single" w:sz="18" w:space="24" w:color="000000"/>
+            <w:bottom w:val="single" w:sz="18" w:space="24" w:color="000000"/>
+            <w:right w:val="single" w:sz="18" w:space="24" w:color="000000"/>
+          </w:pgBorders>
+          <w:pgNumType w:start="1"/>
+          <w:cols w:space="720"/>
+          <w:docGrid w:linePitch="360"/>
         </w:sectPr>
       </w:pPr>
     </w:p>
@@ -49056,6 +48281,18 @@
         </w:tc>
       </w:tr>
     </w:tbl>
+    <w:p>
+      <w:pPr>
+        <w:sectPr>
+          <w:footerReference w:type="default" r:id="rId41"/>
+          <w:pgSz w:w="11906" w:h="16838" w:code="9"/>
+          <w:pgMar w:top="1560" w:right="864" w:bottom="1500" w:left="1296" w:header="270" w:footer="340" w:gutter="0"/>
+          <w:cols w:space="540"/>
+          <w:docGrid w:linePitch="240"/>
+          <w:pgNumType w:start="1"/>
+        </w:sectPr>
+      </w:pPr>
+    </w:p>
     <w:p>
       <w:r>
         <w:t>{{BBG_END}}</w:t>

</xml_diff>